<commit_message>
Compact resume spacing to restore 4-page layout
The LibreOffice-rendered PDF spaced paragraphs looser than the original
Word export, overflowing page 2 and leaving an orphaned job heading with
a large gap before page 3 (5 pages total). Tightened spacing only —
content unchanged:

- Line spacing set to single (was 1.08-1.13x auto)
- Paragraph after-spacing halved
- Bottom margin reduced 0.98" -> 0.5"

Regenerated PDF now matches the original 4-page distribution
(p1 header, p2 experience, p3 Anton Paar/Beckman, p4 education) with
clean page breaks.

https://claude.ai/code/session_014mkWqpoyut58c4C7WDZuWk
</commit_message>
<xml_diff>
--- a/J.Matteo_resume_2026.docx
+++ b/J.Matteo_resume_2026.docx
@@ -4,7 +4,7 @@
   <w:body>
     <w:p>
       <w:pPr>
-        <w:spacing w:after="69" w:line="259" w:lineRule="auto"/>
+        <w:spacing w:after="34" w:line="240" w:lineRule="auto"/>
         <w:ind w:left="-5" w:right="2432"/>
       </w:pPr>
       <w:r>
@@ -33,7 +33,7 @@
     </w:p>
     <w:p>
       <w:pPr>
-        <w:spacing w:after="10"/>
+        <w:spacing w:after="5"/>
         <w:ind w:right="70"/>
       </w:pPr>
       <w:r>
@@ -42,7 +42,7 @@
     </w:p>
     <w:p>
       <w:pPr>
-        <w:spacing w:after="72" w:line="259" w:lineRule="auto"/>
+        <w:spacing w:after="36" w:line="240" w:lineRule="auto"/>
         <w:ind w:left="0" w:firstLine="0"/>
         <w:rPr>
           <w:color w:val="467886"/>
@@ -91,7 +91,7 @@
     </w:p>
     <w:p>
       <w:pPr>
-        <w:spacing w:after="72" w:line="259" w:lineRule="auto"/>
+        <w:spacing w:after="36" w:line="240" w:lineRule="auto"/>
         <w:ind w:left="0" w:firstLine="0"/>
       </w:pPr>
       <w:r>
@@ -125,7 +125,7 @@
     </w:p>
     <w:p>
       <w:pPr>
-        <w:spacing w:after="16" w:line="259" w:lineRule="auto"/>
+        <w:spacing w:after="8" w:line="240" w:lineRule="auto"/>
         <w:ind w:left="0" w:firstLine="0"/>
         <w:jc w:val="right"/>
       </w:pPr>
@@ -698,7 +698,7 @@
     </w:p>
     <w:p>
       <w:pPr>
-        <w:spacing w:after="19" w:line="259" w:lineRule="auto"/>
+        <w:spacing w:after="9" w:line="240" w:lineRule="auto"/>
         <w:ind w:left="-5" w:right="2432"/>
       </w:pPr>
       <w:r>
@@ -721,7 +721,7 @@
     </w:p>
     <w:p>
       <w:pPr>
-        <w:spacing w:after="16" w:line="259" w:lineRule="auto"/>
+        <w:spacing w:after="8" w:line="240" w:lineRule="auto"/>
         <w:ind w:left="0" w:firstLine="0"/>
         <w:jc w:val="right"/>
       </w:pPr>
@@ -1294,7 +1294,7 @@
     </w:p>
     <w:p>
       <w:pPr>
-        <w:spacing w:after="69" w:line="259" w:lineRule="auto"/>
+        <w:spacing w:after="34" w:line="240" w:lineRule="auto"/>
         <w:ind w:left="-5" w:right="2432"/>
       </w:pPr>
       <w:r>
@@ -1438,7 +1438,7 @@
     </w:p>
     <w:p>
       <w:pPr>
-        <w:spacing w:after="69" w:line="259" w:lineRule="auto"/>
+        <w:spacing w:after="34" w:line="240" w:lineRule="auto"/>
         <w:ind w:left="-5" w:right="2432"/>
         <w:rPr>
           <w:b/>
@@ -2027,7 +2027,7 @@
           <w:ilvl w:val="0"/>
           <w:numId w:val="2"/>
         </w:numPr>
-        <w:spacing w:after="60"/>
+        <w:spacing w:after="30"/>
         <w:rPr>
           <w:rFonts w:ascii="Garamond" w:hAnsi="Garamond"/>
         </w:rPr>
@@ -2065,7 +2065,7 @@
     </w:p>
     <w:p>
       <w:pPr>
-        <w:spacing w:after="18" w:line="259" w:lineRule="auto"/>
+        <w:spacing w:after="9" w:line="240" w:lineRule="auto"/>
         <w:ind w:left="0" w:firstLine="0"/>
         <w:jc w:val="right"/>
       </w:pPr>
@@ -2638,7 +2638,7 @@
     </w:p>
     <w:p>
       <w:pPr>
-        <w:spacing w:after="69" w:line="259" w:lineRule="auto"/>
+        <w:spacing w:after="34" w:line="240" w:lineRule="auto"/>
         <w:ind w:left="-5" w:right="2432"/>
       </w:pPr>
       <w:r>
@@ -2707,7 +2707,7 @@
     </w:p>
     <w:p>
       <w:pPr>
-        <w:spacing w:after="17" w:line="259" w:lineRule="auto"/>
+        <w:spacing w:after="8" w:line="240" w:lineRule="auto"/>
         <w:ind w:left="0" w:firstLine="0"/>
         <w:jc w:val="right"/>
       </w:pPr>
@@ -3280,7 +3280,7 @@
     </w:p>
     <w:p>
       <w:pPr>
-        <w:spacing w:after="69" w:line="259" w:lineRule="auto"/>
+        <w:spacing w:after="34" w:line="240" w:lineRule="auto"/>
         <w:ind w:left="-5" w:right="2432"/>
       </w:pPr>
       <w:r>
@@ -3293,7 +3293,7 @@
     <w:p>
       <w:pPr>
         <w:pStyle w:val="PlainText"/>
-        <w:spacing w:line="276" w:lineRule="auto"/>
+        <w:spacing w:line="240" w:lineRule="auto"/>
         <w:rPr>
           <w:rFonts w:ascii="Garamond" w:eastAsia="Times New Roman" w:hAnsi="Garamond" w:cs="Times New Roman"/>
           <w:b/>
@@ -3339,7 +3339,7 @@
     <w:p>
       <w:pPr>
         <w:pStyle w:val="PlainText"/>
-        <w:spacing w:line="276" w:lineRule="auto"/>
+        <w:spacing w:line="240" w:lineRule="auto"/>
         <w:rPr>
           <w:rFonts w:ascii="Garamond" w:eastAsia="Times New Roman" w:hAnsi="Garamond" w:cs="Times New Roman"/>
           <w:b/>
@@ -3378,7 +3378,7 @@
           <w:ilvl w:val="0"/>
           <w:numId w:val="3"/>
         </w:numPr>
-        <w:spacing w:after="60"/>
+        <w:spacing w:after="30"/>
         <w:rPr>
           <w:rFonts w:ascii="Garamond" w:hAnsi="Garamond"/>
         </w:rPr>
@@ -3397,7 +3397,7 @@
           <w:ilvl w:val="0"/>
           <w:numId w:val="3"/>
         </w:numPr>
-        <w:spacing w:after="60"/>
+        <w:spacing w:after="30"/>
         <w:rPr>
           <w:rFonts w:ascii="Garamond" w:hAnsi="Garamond"/>
         </w:rPr>
@@ -3430,7 +3430,7 @@
           <w:ilvl w:val="0"/>
           <w:numId w:val="3"/>
         </w:numPr>
-        <w:spacing w:after="60"/>
+        <w:spacing w:after="30"/>
         <w:rPr>
           <w:rFonts w:ascii="Garamond" w:hAnsi="Garamond"/>
         </w:rPr>
@@ -3449,7 +3449,7 @@
           <w:ilvl w:val="0"/>
           <w:numId w:val="3"/>
         </w:numPr>
-        <w:spacing w:after="60"/>
+        <w:spacing w:after="30"/>
         <w:rPr>
           <w:rFonts w:ascii="Garamond" w:hAnsi="Garamond"/>
         </w:rPr>
@@ -3476,7 +3476,7 @@
           <w:ilvl w:val="0"/>
           <w:numId w:val="3"/>
         </w:numPr>
-        <w:spacing w:after="60"/>
+        <w:spacing w:after="30"/>
         <w:rPr>
           <w:rFonts w:ascii="Garamond" w:hAnsi="Garamond"/>
         </w:rPr>
@@ -3490,7 +3490,7 @@
     </w:p>
     <w:p>
       <w:pPr>
-        <w:spacing w:after="69" w:line="259" w:lineRule="auto"/>
+        <w:spacing w:after="34" w:line="240" w:lineRule="auto"/>
         <w:ind w:left="-5" w:right="2432"/>
         <w:rPr>
           <w:b/>
@@ -3981,7 +3981,7 @@
     </w:p>
     <w:p>
       <w:pPr>
-        <w:spacing w:after="69" w:line="259" w:lineRule="auto"/>
+        <w:spacing w:after="34" w:line="240" w:lineRule="auto"/>
         <w:ind w:left="-5" w:right="2432"/>
         <w:rPr>
           <w:b/>
@@ -4012,7 +4012,7 @@
     </w:p>
     <w:p>
       <w:pPr>
-        <w:spacing w:after="100"/>
+        <w:spacing w:after="50"/>
         <w:rPr>
           <w:rFonts w:ascii="Garamond" w:hAnsi="Garamond"/>
           <w:b/>
@@ -4049,7 +4049,7 @@
           <w:ilvl w:val="0"/>
           <w:numId w:val="3"/>
         </w:numPr>
-        <w:spacing w:after="60"/>
+        <w:spacing w:after="30"/>
         <w:rPr>
           <w:rFonts w:ascii="Garamond" w:hAnsi="Garamond"/>
         </w:rPr>
@@ -4068,7 +4068,7 @@
           <w:ilvl w:val="0"/>
           <w:numId w:val="3"/>
         </w:numPr>
-        <w:spacing w:after="60"/>
+        <w:spacing w:after="30"/>
         <w:rPr>
           <w:rFonts w:ascii="Garamond" w:hAnsi="Garamond"/>
         </w:rPr>
@@ -4087,7 +4087,7 @@
           <w:ilvl w:val="0"/>
           <w:numId w:val="3"/>
         </w:numPr>
-        <w:spacing w:after="60"/>
+        <w:spacing w:after="30"/>
         <w:rPr>
           <w:rFonts w:ascii="Garamond" w:hAnsi="Garamond"/>
         </w:rPr>
@@ -4106,7 +4106,7 @@
           <w:ilvl w:val="0"/>
           <w:numId w:val="3"/>
         </w:numPr>
-        <w:spacing w:after="60"/>
+        <w:spacing w:after="30"/>
         <w:rPr>
           <w:rFonts w:ascii="Garamond" w:hAnsi="Garamond"/>
         </w:rPr>
@@ -4125,7 +4125,7 @@
           <w:ilvl w:val="0"/>
           <w:numId w:val="3"/>
         </w:numPr>
-        <w:spacing w:after="60"/>
+        <w:spacing w:after="30"/>
         <w:rPr>
           <w:rFonts w:ascii="Garamond" w:hAnsi="Garamond"/>
         </w:rPr>
@@ -4153,7 +4153,7 @@
     </w:p>
     <w:p>
       <w:pPr>
-        <w:spacing w:after="69" w:line="259" w:lineRule="auto"/>
+        <w:spacing w:after="34" w:line="240" w:lineRule="auto"/>
         <w:ind w:left="0" w:right="2432" w:firstLine="0"/>
         <w:rPr>
           <w:b/>
@@ -4644,7 +4644,7 @@
     </w:p>
     <w:p>
       <w:pPr>
-        <w:spacing w:after="69" w:line="259" w:lineRule="auto"/>
+        <w:spacing w:after="34" w:line="240" w:lineRule="auto"/>
         <w:ind w:left="-5" w:right="2432"/>
       </w:pPr>
       <w:r>
@@ -4656,7 +4656,7 @@
     </w:p>
     <w:p>
       <w:pPr>
-        <w:spacing w:after="33" w:line="259" w:lineRule="auto"/>
+        <w:spacing w:after="16" w:line="240" w:lineRule="auto"/>
         <w:ind w:left="-5"/>
       </w:pPr>
       <w:r>
@@ -4699,7 +4699,7 @@
           <w:ilvl w:val="0"/>
           <w:numId w:val="1"/>
         </w:numPr>
-        <w:spacing w:after="24"/>
+        <w:spacing w:after="12"/>
         <w:ind w:right="70" w:hanging="360"/>
       </w:pPr>
       <w:r>
@@ -4720,7 +4720,7 @@
     </w:p>
     <w:p>
       <w:pPr>
-        <w:spacing w:after="7"/>
+        <w:spacing w:after="3"/>
         <w:ind w:left="730" w:right="70"/>
       </w:pPr>
       <w:r>
@@ -4738,7 +4738,7 @@
     </w:p>
     <w:p>
       <w:pPr>
-        <w:spacing w:after="17" w:line="259" w:lineRule="auto"/>
+        <w:spacing w:after="8" w:line="240" w:lineRule="auto"/>
         <w:ind w:left="0" w:firstLine="0"/>
         <w:jc w:val="right"/>
       </w:pPr>
@@ -5311,7 +5311,7 @@
     </w:p>
     <w:p>
       <w:pPr>
-        <w:spacing w:after="69" w:line="259" w:lineRule="auto"/>
+        <w:spacing w:after="34" w:line="240" w:lineRule="auto"/>
         <w:ind w:left="-5" w:right="2432"/>
         <w:rPr>
           <w:b/>
@@ -5340,7 +5340,7 @@
     </w:p>
     <w:p>
       <w:pPr>
-        <w:spacing w:after="69" w:line="259" w:lineRule="auto"/>
+        <w:spacing w:after="34" w:line="240" w:lineRule="auto"/>
         <w:ind w:left="-5" w:right="2432"/>
       </w:pPr>
       <w:r>
@@ -5371,7 +5371,7 @@
           <w:ilvl w:val="0"/>
           <w:numId w:val="1"/>
         </w:numPr>
-        <w:spacing w:after="22"/>
+        <w:spacing w:after="11"/>
         <w:ind w:right="70" w:hanging="360"/>
       </w:pPr>
       <w:r>
@@ -5410,7 +5410,7 @@
     </w:p>
     <w:p>
       <w:pPr>
-        <w:spacing w:after="17" w:line="259" w:lineRule="auto"/>
+        <w:spacing w:after="8" w:line="240" w:lineRule="auto"/>
         <w:ind w:left="0" w:firstLine="0"/>
         <w:jc w:val="right"/>
       </w:pPr>
@@ -5983,7 +5983,7 @@
     </w:p>
     <w:p>
       <w:pPr>
-        <w:spacing w:after="69" w:line="259" w:lineRule="auto"/>
+        <w:spacing w:after="34" w:line="240" w:lineRule="auto"/>
         <w:ind w:left="-5" w:right="2432"/>
       </w:pPr>
       <w:r>
@@ -5995,7 +5995,7 @@
     </w:p>
     <w:p>
       <w:pPr>
-        <w:spacing w:after="69" w:line="259" w:lineRule="auto"/>
+        <w:spacing w:after="34" w:line="240" w:lineRule="auto"/>
         <w:ind w:left="-5" w:right="2432"/>
       </w:pPr>
       <w:r>
@@ -6010,7 +6010,7 @@
     </w:p>
     <w:p>
       <w:pPr>
-        <w:spacing w:after="33" w:line="259" w:lineRule="auto"/>
+        <w:spacing w:after="16" w:line="240" w:lineRule="auto"/>
         <w:ind w:left="-5"/>
       </w:pPr>
       <w:r>
@@ -6041,7 +6041,7 @@
           <w:ilvl w:val="0"/>
           <w:numId w:val="1"/>
         </w:numPr>
-        <w:spacing w:after="24"/>
+        <w:spacing w:after="12"/>
         <w:ind w:right="70" w:hanging="360"/>
       </w:pPr>
       <w:r>
@@ -6074,7 +6074,7 @@
     </w:p>
     <w:p>
       <w:pPr>
-        <w:spacing w:after="69" w:line="259" w:lineRule="auto"/>
+        <w:spacing w:after="34" w:line="240" w:lineRule="auto"/>
         <w:ind w:left="-5" w:right="2432"/>
       </w:pPr>
       <w:r>
@@ -6089,7 +6089,7 @@
     </w:p>
     <w:p>
       <w:pPr>
-        <w:spacing w:after="33" w:line="259" w:lineRule="auto"/>
+        <w:spacing w:after="16" w:line="240" w:lineRule="auto"/>
         <w:ind w:left="-5"/>
       </w:pPr>
       <w:r>
@@ -6140,7 +6140,7 @@
     </w:p>
     <w:p>
       <w:pPr>
-        <w:spacing w:after="69" w:line="259" w:lineRule="auto"/>
+        <w:spacing w:after="34" w:line="240" w:lineRule="auto"/>
         <w:ind w:left="-5" w:right="5469"/>
       </w:pPr>
       <w:r>
@@ -6197,7 +6197,7 @@
     </w:p>
     <w:p>
       <w:pPr>
-        <w:spacing w:after="15" w:line="259" w:lineRule="auto"/>
+        <w:spacing w:after="7" w:line="240" w:lineRule="auto"/>
         <w:ind w:left="0" w:firstLine="0"/>
         <w:jc w:val="right"/>
       </w:pPr>
@@ -6770,7 +6770,7 @@
     </w:p>
     <w:p>
       <w:pPr>
-        <w:spacing w:after="69" w:line="259" w:lineRule="auto"/>
+        <w:spacing w:after="34" w:line="240" w:lineRule="auto"/>
         <w:ind w:left="-5" w:right="2432"/>
       </w:pPr>
       <w:r>
@@ -6782,7 +6782,7 @@
     </w:p>
     <w:p>
       <w:pPr>
-        <w:spacing w:after="69" w:line="259" w:lineRule="auto"/>
+        <w:spacing w:after="34" w:line="240" w:lineRule="auto"/>
         <w:ind w:left="-5" w:right="2432"/>
       </w:pPr>
       <w:r>
@@ -6805,7 +6805,7 @@
     </w:p>
     <w:p>
       <w:pPr>
-        <w:spacing w:after="69" w:line="259" w:lineRule="auto"/>
+        <w:spacing w:after="34" w:line="240" w:lineRule="auto"/>
         <w:ind w:left="-5" w:right="2432"/>
       </w:pPr>
       <w:r>
@@ -6828,7 +6828,7 @@
     </w:p>
     <w:p>
       <w:pPr>
-        <w:spacing w:after="69" w:line="259" w:lineRule="auto"/>
+        <w:spacing w:after="34" w:line="240" w:lineRule="auto"/>
         <w:ind w:left="-5" w:right="2432"/>
       </w:pPr>
       <w:r>
@@ -6883,7 +6883,7 @@
     </w:p>
     <w:p>
       <w:pPr>
-        <w:spacing w:after="17" w:line="259" w:lineRule="auto"/>
+        <w:spacing w:after="8" w:line="240" w:lineRule="auto"/>
         <w:ind w:left="0" w:firstLine="0"/>
         <w:jc w:val="right"/>
       </w:pPr>
@@ -7456,7 +7456,7 @@
     </w:p>
     <w:p>
       <w:pPr>
-        <w:spacing w:after="69" w:line="259" w:lineRule="auto"/>
+        <w:spacing w:after="34" w:line="240" w:lineRule="auto"/>
         <w:ind w:left="-5" w:right="2432"/>
       </w:pPr>
       <w:r>
@@ -7530,7 +7530,7 @@
           <w:ilvl w:val="0"/>
           <w:numId w:val="1"/>
         </w:numPr>
-        <w:spacing w:after="23"/>
+        <w:spacing w:after="11"/>
         <w:ind w:right="70" w:hanging="360"/>
       </w:pPr>
       <w:r>
@@ -7566,7 +7566,7 @@
     </w:p>
     <w:p>
       <w:pPr>
-        <w:spacing w:after="0" w:line="259" w:lineRule="auto"/>
+        <w:spacing w:after="0" w:line="240" w:lineRule="auto"/>
         <w:ind w:left="0" w:firstLine="0"/>
       </w:pPr>
       <w:r>
@@ -7578,7 +7578,7 @@
       <w:footerReference w:type="default" r:id="rId10"/>
       <w:footerReference w:type="first" r:id="rId11"/>
       <w:pgSz w:w="12240" w:h="15840"/>
-      <w:pgMar w:top="729" w:right="658" w:bottom="1417" w:left="720" w:header="720" w:footer="718" w:gutter="0"/>
+      <w:pgMar w:top="729" w:right="658" w:bottom="720" w:left="720" w:header="720" w:footer="718" w:gutter="0"/>
       <w:cols w:space="720"/>
     </w:sectPr>
   </w:body>
@@ -8570,7 +8570,7 @@
     <w:name w:val="Normal"/>
     <w:qFormat/>
     <w:pPr>
-      <w:spacing w:after="53" w:line="271" w:lineRule="auto"/>
+      <w:spacing w:after="26" w:line="240" w:lineRule="auto"/>
       <w:ind w:left="10" w:hanging="10"/>
     </w:pPr>
     <w:rPr>
@@ -8587,7 +8587,7 @@
     <w:qFormat/>
     <w:rsid w:val="00DB4855"/>
     <w:pPr>
-      <w:spacing w:before="180" w:after="100"/>
+      <w:spacing w:before="180" w:after="50"/>
       <w:outlineLvl w:val="1"/>
     </w:pPr>
     <w:rPr>

</xml_diff>